<commit_message>
feat: complete Informativo 875 import (25 precedents), improve theme display UI, and version bump to 1.1.026
</commit_message>
<xml_diff>
--- a/ESQUELETO DE ORIENTAÇÃO PARA CADASTRO.docx
+++ b/ESQUELETO DE ORIENTAÇÃO PARA CADASTRO.docx
@@ -1216,6 +1216,169 @@
       </w:r>
     </w:p>
     <w:p/>
+    <w:p/>
+    <w:p/>
+    <w:p>
+      <w:r>
+        <w:t>Ajustes a serem feitos</w:t>
+      </w:r>
+    </w:p>
+    <w:p>
+      <w:pPr>
+        <w:pStyle w:val="PargrafodaLista"/>
+        <w:numPr>
+          <w:ilvl w:val="0"/>
+          <w:numId w:val="9"/>
+        </w:numPr>
+      </w:pPr>
+      <w:r>
+        <w:t xml:space="preserve">Quando vejo Todas as Matérias, aparecem 2 julgados, mesmo que estejam vinculados (por exemplo, </w:t>
+      </w:r>
+      <w:proofErr w:type="spellStart"/>
+      <w:r>
+        <w:t>le</w:t>
+      </w:r>
+      <w:proofErr w:type="spellEnd"/>
+      <w:r>
+        <w:t xml:space="preserve"> um, </w:t>
+      </w:r>
+      <w:proofErr w:type="spellStart"/>
+      <w:r>
+        <w:t>le</w:t>
+      </w:r>
+      <w:proofErr w:type="spellEnd"/>
+      <w:r>
+        <w:t xml:space="preserve"> os 2). Acho que temos de retomar a ideia de que </w:t>
+      </w:r>
+      <w:proofErr w:type="spellStart"/>
+      <w:r>
+        <w:t>so</w:t>
+      </w:r>
+      <w:proofErr w:type="spellEnd"/>
+      <w:r>
+        <w:t xml:space="preserve"> </w:t>
+      </w:r>
+      <w:proofErr w:type="spellStart"/>
+      <w:r>
+        <w:t>apareca</w:t>
+      </w:r>
+      <w:proofErr w:type="spellEnd"/>
+      <w:r>
+        <w:t xml:space="preserve"> uma vez quando for ativada a visualização Todas as matérias, sem prejuízo de aparecer individualmente, como no caso, em processo civil e em tributário. Quero é que não seja </w:t>
+      </w:r>
+      <w:proofErr w:type="spellStart"/>
+      <w:r>
+        <w:t>duplcoiado</w:t>
+      </w:r>
+      <w:proofErr w:type="spellEnd"/>
+      <w:r>
+        <w:t xml:space="preserve"> quando </w:t>
+      </w:r>
+      <w:proofErr w:type="spellStart"/>
+      <w:r>
+        <w:t>apafe</w:t>
+      </w:r>
+      <w:proofErr w:type="spellEnd"/>
+      <w:r>
+        <w:t xml:space="preserve"> </w:t>
+      </w:r>
+      <w:proofErr w:type="spellStart"/>
+      <w:r>
+        <w:t>er</w:t>
+      </w:r>
+      <w:proofErr w:type="spellEnd"/>
+      <w:r>
+        <w:t xml:space="preserve"> Todas as </w:t>
+      </w:r>
+      <w:proofErr w:type="spellStart"/>
+      <w:r>
+        <w:t>Materias</w:t>
+      </w:r>
+      <w:proofErr w:type="spellEnd"/>
+      <w:r>
+        <w:t>.</w:t>
+      </w:r>
+    </w:p>
+    <w:p>
+      <w:pPr>
+        <w:pStyle w:val="PargrafodaLista"/>
+        <w:numPr>
+          <w:ilvl w:val="0"/>
+          <w:numId w:val="9"/>
+        </w:numPr>
+      </w:pPr>
+      <w:r>
+        <w:t xml:space="preserve">Houve alteração nos cards, mas acho bom readaptarmos. Quando clica no inteiro teor e no </w:t>
+      </w:r>
+      <w:proofErr w:type="gramStart"/>
+      <w:r>
+        <w:t>numero</w:t>
+      </w:r>
+      <w:proofErr w:type="gramEnd"/>
+      <w:r>
+        <w:t xml:space="preserve"> do processo, aparece um mesmo card. Nele, tem todas as informações que tínhamos e adicionou o inteiro teor. Quero fazer um ajuste. </w:t>
+      </w:r>
+      <w:r>
+        <w:t xml:space="preserve">Retire o </w:t>
+      </w:r>
+      <w:proofErr w:type="spellStart"/>
+      <w:r>
+        <w:t>icone</w:t>
+      </w:r>
+      <w:proofErr w:type="spellEnd"/>
+      <w:r>
+        <w:t xml:space="preserve"> inteiro teor. O inteiro teor vai aparecer no card </w:t>
+      </w:r>
+      <w:proofErr w:type="spellStart"/>
+      <w:r>
+        <w:t>qiando</w:t>
+      </w:r>
+      <w:proofErr w:type="spellEnd"/>
+      <w:r>
+        <w:t xml:space="preserve"> clica o processo. Mas ficou muito grande esse card. Faca mais moderno e menor para caber na tela. E quero que o texto do inteiro teor </w:t>
+      </w:r>
+      <w:proofErr w:type="spellStart"/>
+      <w:r>
+        <w:t>apareca</w:t>
+      </w:r>
+      <w:proofErr w:type="spellEnd"/>
+      <w:r>
+        <w:t xml:space="preserve"> no meio, com estilo “justificado”, mas pode ser menor o campo do texto. Para caber tudo. Veja a reformatação minimalista e moderna para isso. </w:t>
+      </w:r>
+    </w:p>
+    <w:p>
+      <w:pPr>
+        <w:pStyle w:val="PargrafodaLista"/>
+        <w:numPr>
+          <w:ilvl w:val="0"/>
+          <w:numId w:val="9"/>
+        </w:numPr>
+      </w:pPr>
+      <w:r>
+        <w:t xml:space="preserve">O </w:t>
+      </w:r>
+      <w:proofErr w:type="spellStart"/>
+      <w:proofErr w:type="gramStart"/>
+      <w:r>
+        <w:t>icone</w:t>
+      </w:r>
+      <w:proofErr w:type="spellEnd"/>
+      <w:r>
+        <w:t>/texto Marcar</w:t>
+      </w:r>
+      <w:proofErr w:type="gramEnd"/>
+      <w:r>
+        <w:t xml:space="preserve"> como Não Lido </w:t>
+      </w:r>
+      <w:proofErr w:type="gramStart"/>
+      <w:r>
+        <w:t>esta</w:t>
+      </w:r>
+      <w:proofErr w:type="gramEnd"/>
+      <w:r>
+        <w:t xml:space="preserve"> muito verde e muito grande. Faca mais discreto.</w:t>
+      </w:r>
+    </w:p>
     <w:sectPr>
       <w:pgSz w:w="11906" w:h="16838"/>
       <w:pgMar w:top="1417" w:right="1701" w:bottom="1417" w:left="1701" w:header="708" w:footer="708" w:gutter="0"/>
@@ -1794,6 +1957,95 @@
     </w:lvl>
   </w:abstractNum>
   <w:abstractNum w:abstractNumId="5" w15:restartNumberingAfterBreak="0">
+    <w:nsid w:val="673C377B"/>
+    <w:multiLevelType w:val="hybridMultilevel"/>
+    <w:tmpl w:val="99DAD28E"/>
+    <w:lvl w:ilvl="0" w:tplc="0416000F">
+      <w:start w:val="1"/>
+      <w:numFmt w:val="decimal"/>
+      <w:lvlText w:val="%1."/>
+      <w:lvlJc w:val="left"/>
+      <w:pPr>
+        <w:ind w:left="720" w:hanging="360"/>
+      </w:pPr>
+      <w:rPr>
+        <w:rFonts w:hint="default"/>
+      </w:rPr>
+    </w:lvl>
+    <w:lvl w:ilvl="1" w:tplc="04160019" w:tentative="1">
+      <w:start w:val="1"/>
+      <w:numFmt w:val="lowerLetter"/>
+      <w:lvlText w:val="%2."/>
+      <w:lvlJc w:val="left"/>
+      <w:pPr>
+        <w:ind w:left="1440" w:hanging="360"/>
+      </w:pPr>
+    </w:lvl>
+    <w:lvl w:ilvl="2" w:tplc="0416001B" w:tentative="1">
+      <w:start w:val="1"/>
+      <w:numFmt w:val="lowerRoman"/>
+      <w:lvlText w:val="%3."/>
+      <w:lvlJc w:val="right"/>
+      <w:pPr>
+        <w:ind w:left="2160" w:hanging="180"/>
+      </w:pPr>
+    </w:lvl>
+    <w:lvl w:ilvl="3" w:tplc="0416000F" w:tentative="1">
+      <w:start w:val="1"/>
+      <w:numFmt w:val="decimal"/>
+      <w:lvlText w:val="%4."/>
+      <w:lvlJc w:val="left"/>
+      <w:pPr>
+        <w:ind w:left="2880" w:hanging="360"/>
+      </w:pPr>
+    </w:lvl>
+    <w:lvl w:ilvl="4" w:tplc="04160019" w:tentative="1">
+      <w:start w:val="1"/>
+      <w:numFmt w:val="lowerLetter"/>
+      <w:lvlText w:val="%5."/>
+      <w:lvlJc w:val="left"/>
+      <w:pPr>
+        <w:ind w:left="3600" w:hanging="360"/>
+      </w:pPr>
+    </w:lvl>
+    <w:lvl w:ilvl="5" w:tplc="0416001B" w:tentative="1">
+      <w:start w:val="1"/>
+      <w:numFmt w:val="lowerRoman"/>
+      <w:lvlText w:val="%6."/>
+      <w:lvlJc w:val="right"/>
+      <w:pPr>
+        <w:ind w:left="4320" w:hanging="180"/>
+      </w:pPr>
+    </w:lvl>
+    <w:lvl w:ilvl="6" w:tplc="0416000F" w:tentative="1">
+      <w:start w:val="1"/>
+      <w:numFmt w:val="decimal"/>
+      <w:lvlText w:val="%7."/>
+      <w:lvlJc w:val="left"/>
+      <w:pPr>
+        <w:ind w:left="5040" w:hanging="360"/>
+      </w:pPr>
+    </w:lvl>
+    <w:lvl w:ilvl="7" w:tplc="04160019" w:tentative="1">
+      <w:start w:val="1"/>
+      <w:numFmt w:val="lowerLetter"/>
+      <w:lvlText w:val="%8."/>
+      <w:lvlJc w:val="left"/>
+      <w:pPr>
+        <w:ind w:left="5760" w:hanging="360"/>
+      </w:pPr>
+    </w:lvl>
+    <w:lvl w:ilvl="8" w:tplc="0416001B" w:tentative="1">
+      <w:start w:val="1"/>
+      <w:numFmt w:val="lowerRoman"/>
+      <w:lvlText w:val="%9."/>
+      <w:lvlJc w:val="right"/>
+      <w:pPr>
+        <w:ind w:left="6480" w:hanging="180"/>
+      </w:pPr>
+    </w:lvl>
+  </w:abstractNum>
+  <w:abstractNum w:abstractNumId="6" w15:restartNumberingAfterBreak="0">
     <w:nsid w:val="735C6E02"/>
     <w:multiLevelType w:val="multilevel"/>
     <w:tmpl w:val="887C9E72"/>
@@ -1906,7 +2158,7 @@
       </w:pPr>
     </w:lvl>
   </w:abstractNum>
-  <w:abstractNum w:abstractNumId="6" w15:restartNumberingAfterBreak="0">
+  <w:abstractNum w:abstractNumId="7" w15:restartNumberingAfterBreak="0">
     <w:nsid w:val="74FD5052"/>
     <w:multiLevelType w:val="multilevel"/>
     <w:tmpl w:val="45043B0C"/>
@@ -2019,7 +2271,7 @@
       </w:pPr>
     </w:lvl>
   </w:abstractNum>
-  <w:abstractNum w:abstractNumId="7" w15:restartNumberingAfterBreak="0">
+  <w:abstractNum w:abstractNumId="8" w15:restartNumberingAfterBreak="0">
     <w:nsid w:val="79114336"/>
     <w:multiLevelType w:val="multilevel"/>
     <w:tmpl w:val="581E03E2"/>
@@ -2133,7 +2385,7 @@
     </w:lvl>
   </w:abstractNum>
   <w:num w:numId="1" w16cid:durableId="291713284">
-    <w:abstractNumId w:val="5"/>
+    <w:abstractNumId w:val="6"/>
   </w:num>
   <w:num w:numId="2" w16cid:durableId="247007814">
     <w:abstractNumId w:val="0"/>
@@ -2151,10 +2403,13 @@
     <w:abstractNumId w:val="1"/>
   </w:num>
   <w:num w:numId="7" w16cid:durableId="1003121477">
+    <w:abstractNumId w:val="8"/>
+  </w:num>
+  <w:num w:numId="8" w16cid:durableId="1734232495">
     <w:abstractNumId w:val="7"/>
   </w:num>
-  <w:num w:numId="8" w16cid:durableId="1734232495">
-    <w:abstractNumId w:val="6"/>
+  <w:num w:numId="9" w16cid:durableId="1521620441">
+    <w:abstractNumId w:val="5"/>
   </w:num>
 </w:numbering>
 </file>

</xml_diff>